<commit_message>
Updated the discovery plan. Increase the time for request for produce document to 6 months and consolidated with the discovery plan in the offenseStrategy folder
</commit_message>
<xml_diff>
--- a/Filings/Discovery/Plaintiffs_Discovery_Plan_and_Informational_Statement.docx
+++ b/Filings/Discovery/Plaintiffs_Discovery_Plan_and_Informational_Statement.docx
@@ -214,7 +214,7 @@
         <w:rPr>
           <w:b w:val="0"/>
         </w:rPr>
-        <w:t>Plaintiffs Yibiao Lu and Jie Hu, appearing pro se, submit this proposed discovery plan under Minn. R. Civ. P. 26.06 and the following informational statement under Minn. Gen. R. Prac. 111. Defendant’s Answer is dated August 10, 2026. Plaintiffs propose that the parties confer as required by Rule 26.06(a) and, if possible, submit a joint statement; if the parties cannot agree, each party may submit its own statement. All dates below are proposals subject to the parties’ conferral and to the Court’s scheduling order.</w:t>
+        <w:t>Plaintiffs Yibiao Lu and Jie Hu, appearing pro se, submit this proposed discovery plan under Minn. R. Civ. P. 26.06 and the following informational statement under Minn. Gen. R. Prac. 111. Defendant’s Answer is dated August 10, 2026; the initial due date for the Answer was July 29, 2026. The parties have scheduled the Rule 26.06(a) discovery conference for August 28, 2026. Plaintiffs propose that the parties, if possible, submit a joint statement; if the parties cannot agree, each party may submit its own statement. All dates below are proposals subject to the parties’ conferral and to the Court’s scheduling order.</w:t>
       </w:r>
     </w:p>
     <w:p>
@@ -258,7 +258,7 @@
         <w:t xml:space="preserve">1.  </w:t>
       </w:r>
       <w:r>
-        <w:t>The parties shall confer as soon as practicable, and in any event within 30 days after the initial due date for the Answer, regarding the nature and basis of the claims and defenses, the possibility of settlement, arrangements for initial disclosures, and this discovery plan.</w:t>
+        <w:t>The parties have scheduled the Rule 26.06(a) discovery conference for August 28, 2026 — within 30 days after the July 29, 2026 initial due date for the Answer — to address the nature and basis of the claims and defenses, the possibility of settlement, arrangements for initial disclosures, and this discovery plan. A written report of the discovery plan will be filed within 14 days after the conference (by September 11, 2026).</w:t>
       </w:r>
     </w:p>
     <w:p>
@@ -273,7 +273,7 @@
         <w:t xml:space="preserve">2.  </w:t>
       </w:r>
       <w:r>
-        <w:t>The parties shall exchange initial disclosures under Rule 26.01(a) at or within 60 days after the original due date for the Answer, unless the parties stipulate or the Court orders otherwise.</w:t>
+        <w:t>The parties shall exchange initial disclosures under Rule 26.01(a) on or before September 28, 2026 (within 60 days after the July 29, 2026 initial answer due date), unless the parties stipulate or the Court orders otherwise.</w:t>
       </w:r>
     </w:p>
     <w:p>
@@ -507,7 +507,7 @@
         <w:rPr>
           <w:b w:val="0"/>
         </w:rPr>
-        <w:t>The following dates are proposals, measured from the August 10, 2026 Answer, and are subject to conferral and the Court’s scheduling order:</w:t>
+        <w:t>The following dates are proposals. They are keyed to the July 29, 2026 initial answer due date and the August 28, 2026 discovery conference, and they build in time for a contested discovery process — multiple document tranches and the motions to compel that a document-intensive insurance case can require. All dates are subject to the parties’ conferral and the Court’s scheduling order:</w:t>
       </w:r>
     </w:p>
     <w:tbl>
@@ -578,7 +578,35 @@
               <w:spacing w:after="0" w:before="0" w:line="240" w:lineRule="auto"/>
             </w:pPr>
             <w:r>
-              <w:t>By Sept. 9, 2026</w:t>
+              <w:t>Aug. 28, 2026 (scheduled)</w:t>
+            </w:r>
+          </w:p>
+        </w:tc>
+      </w:tr>
+      <w:tr>
+        <w:tc>
+          <w:tcPr>
+            <w:tcW w:type="dxa" w:w="6000"/>
+          </w:tcPr>
+          <w:p>
+            <w:pPr>
+              <w:spacing w:after="0" w:before="0" w:line="240" w:lineRule="auto"/>
+            </w:pPr>
+            <w:r>
+              <w:t>Written discovery-plan report to the Court</w:t>
+            </w:r>
+          </w:p>
+        </w:tc>
+        <w:tc>
+          <w:tcPr>
+            <w:tcW w:type="dxa" w:w="3360"/>
+          </w:tcPr>
+          <w:p>
+            <w:pPr>
+              <w:spacing w:after="0" w:before="0" w:line="240" w:lineRule="auto"/>
+            </w:pPr>
+            <w:r>
+              <w:t>Sept. 11, 2026</w:t>
             </w:r>
           </w:p>
         </w:tc>
@@ -606,7 +634,7 @@
               <w:spacing w:after="0" w:before="0" w:line="240" w:lineRule="auto"/>
             </w:pPr>
             <w:r>
-              <w:t>By Oct. 9, 2026</w:t>
+              <w:t>Sept. 28, 2026</w:t>
             </w:r>
           </w:p>
         </w:tc>
@@ -634,7 +662,7 @@
               <w:spacing w:after="0" w:before="0" w:line="240" w:lineRule="auto"/>
             </w:pPr>
             <w:r>
-              <w:t>Dec. 15, 2026</w:t>
+              <w:t>Feb. 26, 2027</w:t>
             </w:r>
           </w:p>
         </w:tc>
@@ -662,7 +690,35 @@
               <w:spacing w:after="0" w:before="0" w:line="240" w:lineRule="auto"/>
             </w:pPr>
             <w:r>
-              <w:t>May 28, 2027</w:t>
+              <w:t>Oct. 29, 2027</w:t>
+            </w:r>
+          </w:p>
+        </w:tc>
+      </w:tr>
+      <w:tr>
+        <w:tc>
+          <w:tcPr>
+            <w:tcW w:type="dxa" w:w="6000"/>
+          </w:tcPr>
+          <w:p>
+            <w:pPr>
+              <w:spacing w:after="0" w:before="0" w:line="240" w:lineRule="auto"/>
+            </w:pPr>
+            <w:r>
+              <w:t>Plaintiffs’ expert disclosures (Rule 26.01(b))</w:t>
+            </w:r>
+          </w:p>
+        </w:tc>
+        <w:tc>
+          <w:tcPr>
+            <w:tcW w:type="dxa" w:w="3360"/>
+          </w:tcPr>
+          <w:p>
+            <w:pPr>
+              <w:spacing w:after="0" w:before="0" w:line="240" w:lineRule="auto"/>
+            </w:pPr>
+            <w:r>
+              <w:t>Nov. 30, 2027</w:t>
             </w:r>
           </w:p>
         </w:tc>
@@ -690,35 +746,7 @@
               <w:spacing w:after="0" w:before="0" w:line="240" w:lineRule="auto"/>
             </w:pPr>
             <w:r>
-              <w:t>June 28, 2027</w:t>
-            </w:r>
-          </w:p>
-        </w:tc>
-      </w:tr>
-      <w:tr>
-        <w:tc>
-          <w:tcPr>
-            <w:tcW w:type="dxa" w:w="6000"/>
-          </w:tcPr>
-          <w:p>
-            <w:pPr>
-              <w:spacing w:after="0" w:before="0" w:line="240" w:lineRule="auto"/>
-            </w:pPr>
-            <w:r>
-              <w:t>Plaintiffs’ expert disclosures (Rule 26.01(b))</w:t>
-            </w:r>
-          </w:p>
-        </w:tc>
-        <w:tc>
-          <w:tcPr>
-            <w:tcW w:type="dxa" w:w="3360"/>
-          </w:tcPr>
-          <w:p>
-            <w:pPr>
-              <w:spacing w:after="0" w:before="0" w:line="240" w:lineRule="auto"/>
-            </w:pPr>
-            <w:r>
-              <w:t>June 30, 2027</w:t>
+              <w:t>Dec. 17, 2027</w:t>
             </w:r>
           </w:p>
         </w:tc>
@@ -746,7 +774,7 @@
               <w:spacing w:after="0" w:before="0" w:line="240" w:lineRule="auto"/>
             </w:pPr>
             <w:r>
-              <w:t>July 30, 2027</w:t>
+              <w:t>Dec. 30, 2027</w:t>
             </w:r>
           </w:p>
         </w:tc>
@@ -774,7 +802,7 @@
               <w:spacing w:after="0" w:before="0" w:line="240" w:lineRule="auto"/>
             </w:pPr>
             <w:r>
-              <w:t>Aug. 30, 2027</w:t>
+              <w:t>Jan. 28, 2028</w:t>
             </w:r>
           </w:p>
         </w:tc>
@@ -802,7 +830,7 @@
               <w:spacing w:after="0" w:before="0" w:line="240" w:lineRule="auto"/>
             </w:pPr>
             <w:r>
-              <w:t>Sept. 30, 2027</w:t>
+              <w:t>Feb. 29, 2028</w:t>
             </w:r>
           </w:p>
         </w:tc>
@@ -830,7 +858,7 @@
               <w:spacing w:after="0" w:before="0" w:line="240" w:lineRule="auto"/>
             </w:pPr>
             <w:r>
-              <w:t>Oct. 29, 2027</w:t>
+              <w:t>Jan. 31, 2028</w:t>
             </w:r>
           </w:p>
         </w:tc>
@@ -858,7 +886,7 @@
               <w:spacing w:after="0" w:before="0" w:line="240" w:lineRule="auto"/>
             </w:pPr>
             <w:r>
-              <w:t>Dec. 17, 2027</w:t>
+              <w:t>Apr. 28, 2028</w:t>
             </w:r>
           </w:p>
         </w:tc>
@@ -886,7 +914,7 @@
               <w:spacing w:after="0" w:before="0" w:line="240" w:lineRule="auto"/>
             </w:pPr>
             <w:r>
-              <w:t>Feb. 2028</w:t>
+              <w:t>July 2028</w:t>
             </w:r>
           </w:p>
         </w:tc>
@@ -911,7 +939,7 @@
         <w:rPr>
           <w:b w:val="0"/>
         </w:rPr>
-        <w:t>Minn. Stat. § 604.18 bars pleading a first-party bad-faith claim in the original complaint; the claim may be added only by a later motion to amend supported by affidavits making a prima facie showing. That showing depends on the fact-discovery record, so Plaintiffs propose a separate, later deadline for the § 604.18 motion (June 28, 2027, approximately 30 days after the close of fact discovery) rather than the general December 15, 2026 pleading-amendment deadline. The award of § 604.18 taxable costs, if the claim is added, would be determined by the Court after the fact-finder’s verdict under Minn. Gen. R. Prac. 119.</w:t>
+        <w:t>Minn. Stat. § 604.18 bars pleading a first-party bad-faith claim in the original complaint; the claim may be added only by a later motion to amend supported by affidavits making a prima facie showing. That showing depends on the fact-discovery record, so Plaintiffs propose a separate, later deadline for the § 604.18 motion (December 17, 2027, after the close of fact discovery and Plaintiffs’ expert disclosures) rather than the general February 26, 2027 pleading-amendment deadline. The award of § 604.18 taxable costs, if the claim is added, would be determined by the Court after the fact-finder’s verdict under Minn. Gen. R. Prac. 119.</w:t>
       </w:r>
     </w:p>
     <w:p>
@@ -1054,7 +1082,7 @@
         <w:t xml:space="preserve">Discovery completion:  </w:t>
       </w:r>
       <w:r>
-        <w:t>Fact discovery by May 28, 2027; expert discovery by Sept. 30, 2027 (see Part I.E).</w:t>
+        <w:t>Fact discovery by October 29, 2027; expert discovery by February 29, 2028 (see Part I.E). The schedule allows time for a contested, document-intensive discovery process.</w:t>
       </w:r>
     </w:p>
     <w:p>

</xml_diff>